<commit_message>
Atualiza schemas de documento e evento
</commit_message>
<xml_diff>
--- a/documentacao/Manual de Interoperabilidade de Documentos Arquivísticos.docx
+++ b/documentacao/Manual de Interoperabilidade de Documentos Arquivísticos.docx
@@ -8022,10 +8022,31 @@
     </w:p>
     <w:p>
       <w:pPr>
+        <w:pStyle w:val="PargrafodaLista"/>
+        <w:numPr>
+          <w:ilvl w:val="0"/>
+          <w:numId w:val="2"/>
+        </w:numPr>
         <w:spacing w:after="200"/>
       </w:pPr>
       <w:r>
-        <w:t xml:space="preserve"> </w:t>
+        <w:t xml:space="preserve">As chaves dos </w:t>
+      </w:r>
+      <w:proofErr w:type="spellStart"/>
+      <w:r>
+        <w:t>schemas</w:t>
+      </w:r>
+      <w:proofErr w:type="spellEnd"/>
+      <w:r>
+        <w:t xml:space="preserve"> adotam </w:t>
+      </w:r>
+      <w:proofErr w:type="spellStart"/>
+      <w:r>
+        <w:t>camelCase</w:t>
+      </w:r>
+      <w:proofErr w:type="spellEnd"/>
+      <w:r>
+        <w:t xml:space="preserve"> e não contêm pontos;</w:t>
       </w:r>
     </w:p>
     <w:p>
@@ -9881,7 +9902,7 @@
           </w:tcPr>
           <w:p>
             <w:r>
-              <w:t>Sim</w:t>
+              <w:t>Não</w:t>
             </w:r>
           </w:p>
         </w:tc>
@@ -35035,22 +35056,9 @@
       <w:r>
         <w:t>{ "</w:t>
       </w:r>
-      <w:proofErr w:type="spellStart"/>
       <w:proofErr w:type="gramEnd"/>
       <w:r>
-        <w:t>type</w:t>
-      </w:r>
-      <w:proofErr w:type="spellEnd"/>
-      <w:r>
-        <w:t>": "</w:t>
-      </w:r>
-      <w:proofErr w:type="spellStart"/>
-      <w:r>
-        <w:t>string</w:t>
-      </w:r>
-      <w:proofErr w:type="spellEnd"/>
-      <w:r>
-        <w:t xml:space="preserve">", </w:t>
+        <w:t xml:space="preserve">type": "string", </w:t>
       </w:r>
     </w:p>
     <w:p>
@@ -38303,22 +38311,9 @@
       <w:r>
         <w:t>{ "</w:t>
       </w:r>
-      <w:proofErr w:type="spellStart"/>
       <w:proofErr w:type="gramEnd"/>
       <w:r>
-        <w:t>type</w:t>
-      </w:r>
-      <w:proofErr w:type="spellEnd"/>
-      <w:r>
-        <w:t>": "</w:t>
-      </w:r>
-      <w:proofErr w:type="spellStart"/>
-      <w:r>
-        <w:t>string</w:t>
-      </w:r>
-      <w:proofErr w:type="spellEnd"/>
-      <w:r>
-        <w:t xml:space="preserve">", </w:t>
+        <w:t xml:space="preserve">type": "string", </w:t>
       </w:r>
     </w:p>
     <w:p>

</xml_diff>